<commit_message>
Update CodeBERT classifier to handle input truncation and adjust test to capture parameters
</commit_message>
<xml_diff>
--- a/docs/result-lamps.docx
+++ b/docs/result-lamps.docx
@@ -3,6 +3,9 @@
 <w:document xmlns:wpc="http://schemas.microsoft.com/office/word/2010/wordprocessingCanvas" xmlns:cx="http://schemas.microsoft.com/office/drawing/2014/chartex" xmlns:cx1="http://schemas.microsoft.com/office/drawing/2015/9/8/chartex" xmlns:cx2="http://schemas.microsoft.com/office/drawing/2015/10/21/chartex" xmlns:cx3="http://schemas.microsoft.com/office/drawing/2016/5/9/chartex" xmlns:cx4="http://schemas.microsoft.com/office/drawing/2016/5/10/chartex" xmlns:cx5="http://schemas.microsoft.com/office/drawing/2016/5/11/chartex" xmlns:cx6="http://schemas.microsoft.com/office/drawing/2016/5/12/chartex" xmlns:cx7="http://schemas.microsoft.com/office/drawing/2016/5/13/chartex" xmlns:cx8="http://schemas.microsoft.com/office/drawing/2016/5/14/chartex" xmlns:mc="http://schemas.openxmlformats.org/markup-compatibility/2006" xmlns:aink="http://schemas.microsoft.com/office/drawing/2016/ink" xmlns:am3d="http://schemas.microsoft.com/office/drawing/2017/model3d" xmlns:o="urn:schemas-microsoft-com:office:office" xmlns:oel="http://schemas.microsoft.com/office/2019/extlst" xmlns:r="http://schemas.openxmlformats.org/officeDocument/2006/relationships" xmlns:m="http://schemas.openxmlformats.org/officeDocument/2006/math" xmlns:v="urn:schemas-microsoft-com:vml" xmlns:wp14="http://schemas.microsoft.com/office/word/2010/wordprocessingDrawing" xmlns:wp="http://schemas.openxmlformats.org/drawingml/2006/wordprocessingDrawing" xmlns:w10="urn:schemas-microsoft-com:office:word" xmlns:w="http://schemas.openxmlformats.org/wordprocessingml/2006/main" xmlns:w14="http://schemas.microsoft.com/office/word/2010/wordml" xmlns:w15="http://schemas.microsoft.com/office/word/2012/wordml" xmlns:w16cex="http://schemas.microsoft.com/office/word/2018/wordml/cex" xmlns:w16cid="http://schemas.microsoft.com/office/word/2016/wordml/cid" xmlns:w16="http://schemas.microsoft.com/office/word/2018/wordml" xmlns:w16du="http://schemas.microsoft.com/office/word/2023/wordml/word16du" xmlns:w16sdtdh="http://schemas.microsoft.com/office/word/2020/wordml/sdtdatahash" xmlns:w16sdtfl="http://schemas.microsoft.com/office/word/2024/wordml/sdtformatlock" xmlns:w16se="http://schemas.microsoft.com/office/word/2015/wordml/symex" xmlns:wpg="http://schemas.microsoft.com/office/word/2010/wordprocessingGroup" xmlns:wpi="http://schemas.microsoft.com/office/word/2010/wordprocessingInk" xmlns:wne="http://schemas.microsoft.com/office/word/2006/wordml" xmlns:wps="http://schemas.microsoft.com/office/word/2010/wordprocessingShape" mc:Ignorable="w14 w15 w16se w16cid w16 w16cex w16sdtdh w16sdtfl w16du wp14">
   <w:body>
     <w:p>
+      <w:pPr>
+        <w:pStyle w:val="Heading1"/>
+      </w:pPr>
       <w:r>
         <w:rPr>
           <w:lang w:val="vi-VN"/>
@@ -13,20 +16,13 @@
     <w:p>
       <w:pPr>
         <w:jc w:val="center"/>
-        <w:rPr>
-          <w:lang w:val="vi-VN"/>
-        </w:rPr>
       </w:pPr>
       <w:r>
-        <w:rPr>
-          <w:noProof/>
-          <w:lang w:val="vi-VN"/>
-        </w:rPr>
         <w:drawing>
-          <wp:inline distT="0" distB="0" distL="0" distR="0" wp14:anchorId="29B20DB9" wp14:editId="0BC4CCCF">
-            <wp:extent cx="5561635" cy="1482508"/>
-            <wp:effectExtent l="0" t="0" r="1270" b="3810"/>
-            <wp:docPr id="54348829" name="Picture 1"/>
+          <wp:inline distT="0" distB="0" distL="0" distR="0" wp14:anchorId="3FB76F82" wp14:editId="56A35EC7">
+            <wp:extent cx="5943600" cy="3110230"/>
+            <wp:effectExtent l="0" t="0" r="0" b="0"/>
+            <wp:docPr id="1804503973" name="Picture 1"/>
             <wp:cNvGraphicFramePr>
               <a:graphicFrameLocks xmlns:a="http://schemas.openxmlformats.org/drawingml/2006/main" noChangeAspect="1"/>
             </wp:cNvGraphicFramePr>
@@ -34,7 +30,7 @@
               <a:graphicData uri="http://schemas.openxmlformats.org/drawingml/2006/picture">
                 <pic:pic xmlns:pic="http://schemas.openxmlformats.org/drawingml/2006/picture">
                   <pic:nvPicPr>
-                    <pic:cNvPr id="54348829" name=""/>
+                    <pic:cNvPr id="1804503973" name=""/>
                     <pic:cNvPicPr/>
                   </pic:nvPicPr>
                   <pic:blipFill>
@@ -46,7 +42,7 @@
                   <pic:spPr>
                     <a:xfrm>
                       <a:off x="0" y="0"/>
-                      <a:ext cx="5589460" cy="1489925"/>
+                      <a:ext cx="5943600" cy="3110230"/>
                     </a:xfrm>
                     <a:prstGeom prst="rect">
                       <a:avLst/>
@@ -59,8 +55,97 @@
         </w:drawing>
       </w:r>
     </w:p>
+    <w:tbl>
+      <w:tblPr>
+        <w:tblStyle w:val="TableGrid"/>
+        <w:tblW w:w="0" w:type="auto"/>
+        <w:tblLook w:val="04A0" w:firstRow="1" w:lastRow="0" w:firstColumn="1" w:lastColumn="0" w:noHBand="0" w:noVBand="1"/>
+      </w:tblPr>
+      <w:tblGrid>
+        <w:gridCol w:w="9350"/>
+      </w:tblGrid>
+      <w:tr>
+        <w:tc>
+          <w:tcPr>
+            <w:tcW w:w="9350" w:type="dxa"/>
+          </w:tcPr>
+          <w:p>
+            <w:r>
+              <w:t>{</w:t>
+            </w:r>
+          </w:p>
+          <w:p>
+            <w:r>
+              <w:t xml:space="preserve">  "classifier": "heuristic",</w:t>
+            </w:r>
+          </w:p>
+          <w:p>
+            <w:r>
+              <w:t xml:space="preserve">  "accuracy": 0.7475,</w:t>
+            </w:r>
+          </w:p>
+          <w:p>
+            <w:r>
+              <w:t xml:space="preserve">  "precision": 0.7854671280276817,</w:t>
+            </w:r>
+          </w:p>
+          <w:p>
+            <w:r>
+              <w:t xml:space="preserve">  "recall": 0.681,</w:t>
+            </w:r>
+          </w:p>
+          <w:p>
+            <w:r>
+              <w:t xml:space="preserve">  "f1": 0.729512587038029,</w:t>
+            </w:r>
+          </w:p>
+          <w:p>
+            <w:r>
+              <w:t xml:space="preserve">  "balanced_accuracy": 0.7475,</w:t>
+            </w:r>
+          </w:p>
+          <w:p>
+            <w:r>
+              <w:t xml:space="preserve">  "confusion_matrix": {</w:t>
+            </w:r>
+          </w:p>
+          <w:p>
+            <w:r>
+              <w:t xml:space="preserve">    "tp": 2043,</w:t>
+            </w:r>
+          </w:p>
+          <w:p>
+            <w:r>
+              <w:t xml:space="preserve">    "tn": 2442,</w:t>
+            </w:r>
+          </w:p>
+          <w:p>
+            <w:r>
+              <w:t xml:space="preserve">    "fp": 558,</w:t>
+            </w:r>
+          </w:p>
+          <w:p>
+            <w:r>
+              <w:t xml:space="preserve">    "fn": 957</w:t>
+            </w:r>
+          </w:p>
+          <w:p>
+            <w:r>
+              <w:t xml:space="preserve">  }</w:t>
+            </w:r>
+          </w:p>
+          <w:p>
+            <w:r>
+              <w:t>}</w:t>
+            </w:r>
+          </w:p>
+        </w:tc>
+      </w:tr>
+    </w:tbl>
+    <w:p/>
     <w:p>
       <w:pPr>
+        <w:pStyle w:val="Heading1"/>
         <w:rPr>
           <w:lang w:val="vi-VN"/>
         </w:rPr>
@@ -137,20 +222,18 @@
     <w:p>
       <w:pPr>
         <w:jc w:val="center"/>
-        <w:rPr>
-          <w:lang w:val="vi-VN"/>
-        </w:rPr>
       </w:pPr>
-      <w:r>
-        <w:rPr>
-          <w:noProof/>
-          <w:lang w:val="vi-VN"/>
-        </w:rPr>
+    </w:p>
+    <w:p>
+      <w:pPr>
+        <w:jc w:val="center"/>
+      </w:pPr>
+      <w:r>
         <w:drawing>
-          <wp:inline distT="0" distB="0" distL="0" distR="0" wp14:anchorId="59D772E9" wp14:editId="16B5BE30">
-            <wp:extent cx="5729468" cy="1473379"/>
-            <wp:effectExtent l="0" t="0" r="5080" b="0"/>
-            <wp:docPr id="2015698874" name="Picture 1"/>
+          <wp:inline distT="0" distB="0" distL="0" distR="0" wp14:anchorId="6879A6E2" wp14:editId="08243D1B">
+            <wp:extent cx="5943600" cy="3250565"/>
+            <wp:effectExtent l="0" t="0" r="0" b="6985"/>
+            <wp:docPr id="1680905715" name="Picture 1"/>
             <wp:cNvGraphicFramePr>
               <a:graphicFrameLocks xmlns:a="http://schemas.openxmlformats.org/drawingml/2006/main" noChangeAspect="1"/>
             </wp:cNvGraphicFramePr>
@@ -158,7 +241,7 @@
               <a:graphicData uri="http://schemas.openxmlformats.org/drawingml/2006/picture">
                 <pic:pic xmlns:pic="http://schemas.openxmlformats.org/drawingml/2006/picture">
                   <pic:nvPicPr>
-                    <pic:cNvPr id="2015698874" name=""/>
+                    <pic:cNvPr id="1680905715" name=""/>
                     <pic:cNvPicPr/>
                   </pic:nvPicPr>
                   <pic:blipFill>
@@ -170,7 +253,7 @@
                   <pic:spPr>
                     <a:xfrm>
                       <a:off x="0" y="0"/>
-                      <a:ext cx="5746195" cy="1477681"/>
+                      <a:ext cx="5943600" cy="3250565"/>
                     </a:xfrm>
                     <a:prstGeom prst="rect">
                       <a:avLst/>
@@ -183,125 +266,163 @@
         </w:drawing>
       </w:r>
     </w:p>
+    <w:tbl>
+      <w:tblPr>
+        <w:tblStyle w:val="TableGrid"/>
+        <w:tblW w:w="0" w:type="auto"/>
+        <w:tblLook w:val="04A0" w:firstRow="1" w:lastRow="0" w:firstColumn="1" w:lastColumn="0" w:noHBand="0" w:noVBand="1"/>
+      </w:tblPr>
+      <w:tblGrid>
+        <w:gridCol w:w="9350"/>
+      </w:tblGrid>
+      <w:tr>
+        <w:tc>
+          <w:tcPr>
+            <w:tcW w:w="9350" w:type="dxa"/>
+          </w:tcPr>
+          <w:p>
+            <w:pPr>
+              <w:jc w:val="both"/>
+            </w:pPr>
+            <w:r>
+              <w:t>{</w:t>
+            </w:r>
+          </w:p>
+          <w:p>
+            <w:pPr>
+              <w:jc w:val="both"/>
+            </w:pPr>
+            <w:r>
+              <w:t xml:space="preserve">  "classifier": "tfidf",</w:t>
+            </w:r>
+          </w:p>
+          <w:p>
+            <w:pPr>
+              <w:jc w:val="both"/>
+            </w:pPr>
+            <w:r>
+              <w:t xml:space="preserve">  "accuracy": 0.9811666666666666,</w:t>
+            </w:r>
+          </w:p>
+          <w:p>
+            <w:pPr>
+              <w:jc w:val="both"/>
+            </w:pPr>
+            <w:r>
+              <w:t xml:space="preserve">  "precision": 0.9958777052559258,</w:t>
+            </w:r>
+          </w:p>
+          <w:p>
+            <w:pPr>
+              <w:jc w:val="both"/>
+            </w:pPr>
+            <w:r>
+              <w:t xml:space="preserve">  "recall": 0.9663333333333334,</w:t>
+            </w:r>
+          </w:p>
+          <w:p>
+            <w:pPr>
+              <w:jc w:val="both"/>
+            </w:pPr>
+            <w:r>
+              <w:t xml:space="preserve">  "f1": 0.9808830993063778,</w:t>
+            </w:r>
+          </w:p>
+          <w:p>
+            <w:pPr>
+              <w:jc w:val="both"/>
+            </w:pPr>
+            <w:r>
+              <w:t xml:space="preserve">  "balanced_accuracy": 0.9811666666666667,</w:t>
+            </w:r>
+          </w:p>
+          <w:p>
+            <w:pPr>
+              <w:jc w:val="both"/>
+            </w:pPr>
+            <w:r>
+              <w:t xml:space="preserve">  "confusion_matrix": {</w:t>
+            </w:r>
+          </w:p>
+          <w:p>
+            <w:pPr>
+              <w:jc w:val="both"/>
+            </w:pPr>
+            <w:r>
+              <w:t xml:space="preserve">    "tp": 2899,</w:t>
+            </w:r>
+          </w:p>
+          <w:p>
+            <w:pPr>
+              <w:jc w:val="both"/>
+            </w:pPr>
+            <w:r>
+              <w:t xml:space="preserve">    "tn": 2988,</w:t>
+            </w:r>
+          </w:p>
+          <w:p>
+            <w:pPr>
+              <w:jc w:val="both"/>
+            </w:pPr>
+            <w:r>
+              <w:t xml:space="preserve">    "fp": 12,</w:t>
+            </w:r>
+          </w:p>
+          <w:p>
+            <w:pPr>
+              <w:jc w:val="both"/>
+            </w:pPr>
+            <w:r>
+              <w:t xml:space="preserve">    "fn": 101</w:t>
+            </w:r>
+          </w:p>
+          <w:p>
+            <w:pPr>
+              <w:jc w:val="both"/>
+            </w:pPr>
+            <w:r>
+              <w:t xml:space="preserve">  }</w:t>
+            </w:r>
+          </w:p>
+          <w:p>
+            <w:pPr>
+              <w:jc w:val="both"/>
+            </w:pPr>
+            <w:r>
+              <w:t>}</w:t>
+            </w:r>
+          </w:p>
+        </w:tc>
+      </w:tr>
+    </w:tbl>
+    <w:p/>
+    <w:p/>
+    <w:p/>
+    <w:p/>
+    <w:p/>
+    <w:p/>
+    <w:p/>
     <w:p>
       <w:pPr>
-        <w:jc w:val="center"/>
+        <w:pStyle w:val="Heading1"/>
+      </w:pPr>
+      <w:r>
         <w:rPr>
           <w:lang w:val="vi-VN"/>
         </w:rPr>
-      </w:pPr>
+        <w:t>Train CodeBERT:</w:t>
+      </w:r>
     </w:p>
     <w:p>
       <w:pPr>
         <w:jc w:val="center"/>
-        <w:rPr>
-          <w:lang w:val="vi-VN"/>
-        </w:rPr>
       </w:pPr>
-    </w:p>
-    <w:p>
-      <w:pPr>
-        <w:jc w:val="center"/>
-        <w:rPr>
-          <w:lang w:val="vi-VN"/>
-        </w:rPr>
-      </w:pPr>
-    </w:p>
-    <w:p>
-      <w:pPr>
-        <w:jc w:val="center"/>
-        <w:rPr>
-          <w:lang w:val="vi-VN"/>
-        </w:rPr>
-      </w:pPr>
-    </w:p>
-    <w:p>
-      <w:pPr>
-        <w:jc w:val="center"/>
-        <w:rPr>
-          <w:lang w:val="vi-VN"/>
-        </w:rPr>
-      </w:pPr>
-    </w:p>
-    <w:p>
-      <w:pPr>
-        <w:jc w:val="center"/>
-        <w:rPr>
-          <w:lang w:val="vi-VN"/>
-        </w:rPr>
-      </w:pPr>
-    </w:p>
-    <w:p>
-      <w:pPr>
-        <w:jc w:val="center"/>
-        <w:rPr>
-          <w:lang w:val="vi-VN"/>
-        </w:rPr>
-      </w:pPr>
-    </w:p>
-    <w:p>
-      <w:pPr>
-        <w:jc w:val="center"/>
-        <w:rPr>
-          <w:lang w:val="vi-VN"/>
-        </w:rPr>
-      </w:pPr>
-    </w:p>
-    <w:p>
-      <w:pPr>
-        <w:jc w:val="center"/>
-        <w:rPr>
-          <w:lang w:val="vi-VN"/>
-        </w:rPr>
-      </w:pPr>
-    </w:p>
-    <w:p>
-      <w:pPr>
-        <w:jc w:val="center"/>
-        <w:rPr>
-          <w:lang w:val="vi-VN"/>
-        </w:rPr>
-      </w:pPr>
-    </w:p>
-    <w:p>
-      <w:pPr>
-        <w:jc w:val="center"/>
-        <w:rPr>
-          <w:lang w:val="vi-VN"/>
-        </w:rPr>
-      </w:pPr>
-    </w:p>
-    <w:p>
-      <w:pPr>
-        <w:rPr>
-          <w:lang w:val="vi-VN"/>
-        </w:rPr>
-      </w:pPr>
-      <w:r>
-        <w:rPr>
-          <w:lang w:val="vi-VN"/>
-        </w:rPr>
-        <w:lastRenderedPageBreak/>
-        <w:t>Train CodeBERT:</w:t>
-      </w:r>
-    </w:p>
-    <w:p>
-      <w:pPr>
-        <w:jc w:val="center"/>
-        <w:rPr>
-          <w:lang w:val="vi-VN"/>
-        </w:rPr>
-      </w:pPr>
-      <w:r>
-        <w:rPr>
-          <w:noProof/>
-          <w:lang w:val="vi-VN"/>
-        </w:rPr>
+      <w:r>
         <w:drawing>
-          <wp:inline distT="0" distB="0" distL="0" distR="0" wp14:anchorId="63DDC56C" wp14:editId="423C0399">
-            <wp:extent cx="5197033" cy="3592394"/>
-            <wp:effectExtent l="0" t="0" r="3810" b="8255"/>
-            <wp:docPr id="193391642" name="Picture 1"/>
+          <wp:inline distT="0" distB="0" distL="0" distR="0" wp14:anchorId="35C161D7" wp14:editId="758646FA">
+            <wp:extent cx="5943600" cy="3735070"/>
+            <wp:effectExtent l="0" t="0" r="0" b="0"/>
+            <wp:docPr id="39617118" name="Picture 1"/>
             <wp:cNvGraphicFramePr>
               <a:graphicFrameLocks xmlns:a="http://schemas.openxmlformats.org/drawingml/2006/main" noChangeAspect="1"/>
             </wp:cNvGraphicFramePr>
@@ -309,7 +430,7 @@
               <a:graphicData uri="http://schemas.openxmlformats.org/drawingml/2006/picture">
                 <pic:pic xmlns:pic="http://schemas.openxmlformats.org/drawingml/2006/picture">
                   <pic:nvPicPr>
-                    <pic:cNvPr id="193391642" name=""/>
+                    <pic:cNvPr id="39617118" name=""/>
                     <pic:cNvPicPr/>
                   </pic:nvPicPr>
                   <pic:blipFill>
@@ -321,7 +442,7 @@
                   <pic:spPr>
                     <a:xfrm>
                       <a:off x="0" y="0"/>
-                      <a:ext cx="5205987" cy="3598583"/>
+                      <a:ext cx="5943600" cy="3735070"/>
                     </a:xfrm>
                     <a:prstGeom prst="rect">
                       <a:avLst/>
@@ -336,34 +457,14 @@
     </w:p>
     <w:p>
       <w:pPr>
-        <w:rPr>
-          <w:lang w:val="vi-VN"/>
-        </w:rPr>
+        <w:jc w:val="center"/>
       </w:pPr>
       <w:r>
-        <w:rPr>
-          <w:lang w:val="vi-VN"/>
-        </w:rPr>
-        <w:t>Evaluate CodeBERT:</w:t>
-      </w:r>
-    </w:p>
-    <w:p>
-      <w:pPr>
-        <w:jc w:val="center"/>
-        <w:rPr>
-          <w:lang w:val="vi-VN"/>
-        </w:rPr>
-      </w:pPr>
-      <w:r>
-        <w:rPr>
-          <w:noProof/>
-          <w:lang w:val="vi-VN"/>
-        </w:rPr>
         <w:drawing>
-          <wp:inline distT="0" distB="0" distL="0" distR="0" wp14:anchorId="21C0CCB7" wp14:editId="36F49659">
-            <wp:extent cx="5798916" cy="1689492"/>
-            <wp:effectExtent l="0" t="0" r="0" b="6350"/>
-            <wp:docPr id="88037696" name="Picture 1"/>
+          <wp:inline distT="0" distB="0" distL="0" distR="0" wp14:anchorId="5C73E7A9" wp14:editId="658B215F">
+            <wp:extent cx="5544324" cy="2743583"/>
+            <wp:effectExtent l="0" t="0" r="0" b="0"/>
+            <wp:docPr id="2020667441" name="Picture 1"/>
             <wp:cNvGraphicFramePr>
               <a:graphicFrameLocks xmlns:a="http://schemas.openxmlformats.org/drawingml/2006/main" noChangeAspect="1"/>
             </wp:cNvGraphicFramePr>
@@ -371,7 +472,7 @@
               <a:graphicData uri="http://schemas.openxmlformats.org/drawingml/2006/picture">
                 <pic:pic xmlns:pic="http://schemas.openxmlformats.org/drawingml/2006/picture">
                   <pic:nvPicPr>
-                    <pic:cNvPr id="88037696" name=""/>
+                    <pic:cNvPr id="2020667441" name=""/>
                     <pic:cNvPicPr/>
                   </pic:nvPicPr>
                   <pic:blipFill>
@@ -383,7 +484,7 @@
                   <pic:spPr>
                     <a:xfrm>
                       <a:off x="0" y="0"/>
-                      <a:ext cx="5811876" cy="1693268"/>
+                      <a:ext cx="5544324" cy="2743583"/>
                     </a:xfrm>
                     <a:prstGeom prst="rect">
                       <a:avLst/>
@@ -394,6 +495,547 @@
             </a:graphic>
           </wp:inline>
         </w:drawing>
+      </w:r>
+    </w:p>
+    <w:tbl>
+      <w:tblPr>
+        <w:tblStyle w:val="TableGrid"/>
+        <w:tblW w:w="0" w:type="auto"/>
+        <w:tblLook w:val="04A0" w:firstRow="1" w:lastRow="0" w:firstColumn="1" w:lastColumn="0" w:noHBand="0" w:noVBand="1"/>
+      </w:tblPr>
+      <w:tblGrid>
+        <w:gridCol w:w="9350"/>
+      </w:tblGrid>
+      <w:tr>
+        <w:tc>
+          <w:tcPr>
+            <w:tcW w:w="9350" w:type="dxa"/>
+          </w:tcPr>
+          <w:p>
+            <w:pPr>
+              <w:jc w:val="both"/>
+            </w:pPr>
+            <w:r>
+              <w:t>{</w:t>
+            </w:r>
+          </w:p>
+          <w:p>
+            <w:pPr>
+              <w:jc w:val="both"/>
+            </w:pPr>
+            <w:r>
+              <w:t xml:space="preserve">  "eval_loss": 0.058332543820142746,</w:t>
+            </w:r>
+          </w:p>
+          <w:p>
+            <w:pPr>
+              <w:jc w:val="both"/>
+            </w:pPr>
+            <w:r>
+              <w:t xml:space="preserve">  "eval_accuracy": 0.9883333333333333,</w:t>
+            </w:r>
+          </w:p>
+          <w:p>
+            <w:pPr>
+              <w:jc w:val="both"/>
+            </w:pPr>
+            <w:r>
+              <w:lastRenderedPageBreak/>
+              <w:t xml:space="preserve">  "eval_precision": 1.0,</w:t>
+            </w:r>
+          </w:p>
+          <w:p>
+            <w:pPr>
+              <w:jc w:val="both"/>
+            </w:pPr>
+            <w:r>
+              <w:t xml:space="preserve">  "eval_recall": 0.9766666666666667,</w:t>
+            </w:r>
+          </w:p>
+          <w:p>
+            <w:pPr>
+              <w:jc w:val="both"/>
+            </w:pPr>
+            <w:r>
+              <w:t xml:space="preserve">  "eval_f1": 0.9881956155143339,</w:t>
+            </w:r>
+          </w:p>
+          <w:p>
+            <w:pPr>
+              <w:jc w:val="both"/>
+            </w:pPr>
+            <w:r>
+              <w:t xml:space="preserve">  "eval_balanced_accuracy": 0.9883333333333333,</w:t>
+            </w:r>
+          </w:p>
+          <w:p>
+            <w:pPr>
+              <w:jc w:val="both"/>
+            </w:pPr>
+            <w:r>
+              <w:t xml:space="preserve">  "eval_runtime": 2.5255,</w:t>
+            </w:r>
+          </w:p>
+          <w:p>
+            <w:pPr>
+              <w:jc w:val="both"/>
+            </w:pPr>
+            <w:r>
+              <w:t xml:space="preserve">  "eval_samples_per_second": 237.577,</w:t>
+            </w:r>
+          </w:p>
+          <w:p>
+            <w:pPr>
+              <w:jc w:val="both"/>
+            </w:pPr>
+            <w:r>
+              <w:t xml:space="preserve">  "eval_steps_per_second": 3.96,</w:t>
+            </w:r>
+          </w:p>
+          <w:p>
+            <w:pPr>
+              <w:jc w:val="both"/>
+            </w:pPr>
+            <w:r>
+              <w:t xml:space="preserve">  "epoch": 5.0</w:t>
+            </w:r>
+          </w:p>
+          <w:p>
+            <w:pPr>
+              <w:jc w:val="both"/>
+            </w:pPr>
+            <w:r>
+              <w:t>}</w:t>
+            </w:r>
+          </w:p>
+        </w:tc>
+      </w:tr>
+    </w:tbl>
+    <w:p/>
+    <w:p>
+      <w:r>
+        <w:t>Chỉ có 5epoch vì config giống với bài báo</w:t>
+      </w:r>
+      <w:r>
+        <w:t>. Config bài báo:</w:t>
+      </w:r>
+    </w:p>
+    <w:p>
+      <w:r>
+        <w:drawing>
+          <wp:inline distT="0" distB="0" distL="0" distR="0" wp14:anchorId="6D3545DE" wp14:editId="2FC654CE">
+            <wp:extent cx="4915586" cy="2915057"/>
+            <wp:effectExtent l="0" t="0" r="0" b="0"/>
+            <wp:docPr id="1089814620" name="Picture 1"/>
+            <wp:cNvGraphicFramePr>
+              <a:graphicFrameLocks xmlns:a="http://schemas.openxmlformats.org/drawingml/2006/main" noChangeAspect="1"/>
+            </wp:cNvGraphicFramePr>
+            <a:graphic xmlns:a="http://schemas.openxmlformats.org/drawingml/2006/main">
+              <a:graphicData uri="http://schemas.openxmlformats.org/drawingml/2006/picture">
+                <pic:pic xmlns:pic="http://schemas.openxmlformats.org/drawingml/2006/picture">
+                  <pic:nvPicPr>
+                    <pic:cNvPr id="1089814620" name=""/>
+                    <pic:cNvPicPr/>
+                  </pic:nvPicPr>
+                  <pic:blipFill>
+                    <a:blip r:embed="rId9"/>
+                    <a:stretch>
+                      <a:fillRect/>
+                    </a:stretch>
+                  </pic:blipFill>
+                  <pic:spPr>
+                    <a:xfrm>
+                      <a:off x="0" y="0"/>
+                      <a:ext cx="4915586" cy="2915057"/>
+                    </a:xfrm>
+                    <a:prstGeom prst="rect">
+                      <a:avLst/>
+                    </a:prstGeom>
+                  </pic:spPr>
+                </pic:pic>
+              </a:graphicData>
+            </a:graphic>
+          </wp:inline>
+        </w:drawing>
+      </w:r>
+    </w:p>
+    <w:p>
+      <w:r>
+        <w:rPr>
+          <w:lang w:val="vi-VN"/>
+        </w:rPr>
+        <w:t>Evaluate CodeBERT:</w:t>
+      </w:r>
+    </w:p>
+    <w:p>
+      <w:pPr>
+        <w:jc w:val="center"/>
+      </w:pPr>
+      <w:r>
+        <w:drawing>
+          <wp:inline distT="0" distB="0" distL="0" distR="0" wp14:anchorId="29F159C2" wp14:editId="6618712A">
+            <wp:extent cx="5943600" cy="1243965"/>
+            <wp:effectExtent l="0" t="0" r="0" b="0"/>
+            <wp:docPr id="558750578" name="Picture 1"/>
+            <wp:cNvGraphicFramePr>
+              <a:graphicFrameLocks xmlns:a="http://schemas.openxmlformats.org/drawingml/2006/main" noChangeAspect="1"/>
+            </wp:cNvGraphicFramePr>
+            <a:graphic xmlns:a="http://schemas.openxmlformats.org/drawingml/2006/main">
+              <a:graphicData uri="http://schemas.openxmlformats.org/drawingml/2006/picture">
+                <pic:pic xmlns:pic="http://schemas.openxmlformats.org/drawingml/2006/picture">
+                  <pic:nvPicPr>
+                    <pic:cNvPr id="558750578" name=""/>
+                    <pic:cNvPicPr/>
+                  </pic:nvPicPr>
+                  <pic:blipFill>
+                    <a:blip r:embed="rId10"/>
+                    <a:stretch>
+                      <a:fillRect/>
+                    </a:stretch>
+                  </pic:blipFill>
+                  <pic:spPr>
+                    <a:xfrm>
+                      <a:off x="0" y="0"/>
+                      <a:ext cx="5943600" cy="1243965"/>
+                    </a:xfrm>
+                    <a:prstGeom prst="rect">
+                      <a:avLst/>
+                    </a:prstGeom>
+                  </pic:spPr>
+                </pic:pic>
+              </a:graphicData>
+            </a:graphic>
+          </wp:inline>
+        </w:drawing>
+      </w:r>
+    </w:p>
+    <w:tbl>
+      <w:tblPr>
+        <w:tblStyle w:val="TableGrid"/>
+        <w:tblW w:w="0" w:type="auto"/>
+        <w:tblLook w:val="04A0" w:firstRow="1" w:lastRow="0" w:firstColumn="1" w:lastColumn="0" w:noHBand="0" w:noVBand="1"/>
+      </w:tblPr>
+      <w:tblGrid>
+        <w:gridCol w:w="9350"/>
+      </w:tblGrid>
+      <w:tr>
+        <w:tc>
+          <w:tcPr>
+            <w:tcW w:w="9350" w:type="dxa"/>
+          </w:tcPr>
+          <w:p>
+            <w:r>
+              <w:t>{</w:t>
+            </w:r>
+          </w:p>
+          <w:p>
+            <w:r>
+              <w:t xml:space="preserve">  "classifier": "codebert",</w:t>
+            </w:r>
+          </w:p>
+          <w:p>
+            <w:r>
+              <w:t xml:space="preserve">  "accuracy": 0.9961666666666666,</w:t>
+            </w:r>
+          </w:p>
+          <w:p>
+            <w:r>
+              <w:t xml:space="preserve">  "precision": 0.9989943010392223,</w:t>
+            </w:r>
+          </w:p>
+          <w:p>
+            <w:r>
+              <w:t xml:space="preserve">  "recall": 0.9933333333333333,</w:t>
+            </w:r>
+          </w:p>
+          <w:p>
+            <w:r>
+              <w:t xml:space="preserve">  "f1": 0.9961557746949691,</w:t>
+            </w:r>
+          </w:p>
+          <w:p>
+            <w:r>
+              <w:lastRenderedPageBreak/>
+              <w:t xml:space="preserve">  "balanced_accuracy": 0.9961666666666666,</w:t>
+            </w:r>
+          </w:p>
+          <w:p>
+            <w:r>
+              <w:t xml:space="preserve">  "confusion_matrix": {</w:t>
+            </w:r>
+          </w:p>
+          <w:p>
+            <w:r>
+              <w:t xml:space="preserve">    "tp": 2980,</w:t>
+            </w:r>
+          </w:p>
+          <w:p>
+            <w:r>
+              <w:t xml:space="preserve">    "tn": 2997,</w:t>
+            </w:r>
+          </w:p>
+          <w:p>
+            <w:r>
+              <w:t xml:space="preserve">    "fp": 3,</w:t>
+            </w:r>
+          </w:p>
+          <w:p>
+            <w:r>
+              <w:t xml:space="preserve">    "fn": 20</w:t>
+            </w:r>
+          </w:p>
+          <w:p>
+            <w:r>
+              <w:t xml:space="preserve">  }</w:t>
+            </w:r>
+          </w:p>
+          <w:p>
+            <w:r>
+              <w:t>}</w:t>
+            </w:r>
+          </w:p>
+        </w:tc>
+      </w:tr>
+    </w:tbl>
+    <w:p/>
+    <w:p>
+      <w:pPr>
+        <w:pStyle w:val="Heading1"/>
+      </w:pPr>
+      <w:r>
+        <w:t>Compare classifiers</w:t>
+      </w:r>
+    </w:p>
+    <w:p>
+      <w:r>
+        <w:t>{</w:t>
+      </w:r>
+    </w:p>
+    <w:p>
+      <w:r>
+        <w:t xml:space="preserve">  "best_classifier": "codebert",</w:t>
+      </w:r>
+    </w:p>
+    <w:p>
+      <w:r>
+        <w:t xml:space="preserve">  "selection_metric": "f1",</w:t>
+      </w:r>
+    </w:p>
+    <w:p>
+      <w:r>
+        <w:t xml:space="preserve">  "results": {</w:t>
+      </w:r>
+    </w:p>
+    <w:p>
+      <w:r>
+        <w:t xml:space="preserve">    "heuristic": {</w:t>
+      </w:r>
+    </w:p>
+    <w:p>
+      <w:r>
+        <w:t xml:space="preserve">      "accuracy": 0.7475,</w:t>
+      </w:r>
+    </w:p>
+    <w:p>
+      <w:r>
+        <w:t xml:space="preserve">      "precision": 0.7854671280276817,</w:t>
+      </w:r>
+    </w:p>
+    <w:p>
+      <w:r>
+        <w:t xml:space="preserve">      "recall": 0.681,</w:t>
+      </w:r>
+    </w:p>
+    <w:p>
+      <w:r>
+        <w:t xml:space="preserve">      "f1": 0.729512587038029,</w:t>
+      </w:r>
+    </w:p>
+    <w:p>
+      <w:r>
+        <w:t xml:space="preserve">      "balanced_accuracy": 0.7475,</w:t>
+      </w:r>
+    </w:p>
+    <w:p>
+      <w:r>
+        <w:t xml:space="preserve">      "confusion_matrix": {</w:t>
+      </w:r>
+    </w:p>
+    <w:p>
+      <w:r>
+        <w:t xml:space="preserve">        "tp": 2043,</w:t>
+      </w:r>
+    </w:p>
+    <w:p>
+      <w:r>
+        <w:t xml:space="preserve">        "tn": 2442,</w:t>
+      </w:r>
+    </w:p>
+    <w:p>
+      <w:r>
+        <w:t xml:space="preserve">        "fp": 558,</w:t>
+      </w:r>
+    </w:p>
+    <w:p>
+      <w:r>
+        <w:t xml:space="preserve">        "fn": 957</w:t>
+      </w:r>
+    </w:p>
+    <w:p>
+      <w:r>
+        <w:t xml:space="preserve">      }</w:t>
+      </w:r>
+    </w:p>
+    <w:p>
+      <w:r>
+        <w:t xml:space="preserve">    },</w:t>
+      </w:r>
+    </w:p>
+    <w:p>
+      <w:r>
+        <w:t xml:space="preserve">    "tfidf": {</w:t>
+      </w:r>
+    </w:p>
+    <w:p>
+      <w:r>
+        <w:lastRenderedPageBreak/>
+        <w:t xml:space="preserve">      "accuracy": 0.9811666666666666,</w:t>
+      </w:r>
+    </w:p>
+    <w:p>
+      <w:r>
+        <w:t xml:space="preserve">      "precision": 0.9958777052559258,</w:t>
+      </w:r>
+    </w:p>
+    <w:p>
+      <w:r>
+        <w:t xml:space="preserve">      "recall": 0.9663333333333334,</w:t>
+      </w:r>
+    </w:p>
+    <w:p>
+      <w:r>
+        <w:t xml:space="preserve">      "f1": 0.9808830993063778,</w:t>
+      </w:r>
+    </w:p>
+    <w:p>
+      <w:r>
+        <w:t xml:space="preserve">      "balanced_accuracy": 0.9811666666666667,</w:t>
+      </w:r>
+    </w:p>
+    <w:p>
+      <w:r>
+        <w:t xml:space="preserve">      "confusion_matrix": {</w:t>
+      </w:r>
+    </w:p>
+    <w:p>
+      <w:r>
+        <w:t xml:space="preserve">        "tp": 2899,</w:t>
+      </w:r>
+    </w:p>
+    <w:p>
+      <w:r>
+        <w:t xml:space="preserve">        "tn": 2988,</w:t>
+      </w:r>
+    </w:p>
+    <w:p>
+      <w:r>
+        <w:t xml:space="preserve">        "fp": 12,</w:t>
+      </w:r>
+    </w:p>
+    <w:p>
+      <w:r>
+        <w:t xml:space="preserve">        "fn": 101</w:t>
+      </w:r>
+    </w:p>
+    <w:p>
+      <w:r>
+        <w:t xml:space="preserve">      }</w:t>
+      </w:r>
+    </w:p>
+    <w:p>
+      <w:r>
+        <w:t xml:space="preserve">    },</w:t>
+      </w:r>
+    </w:p>
+    <w:p>
+      <w:r>
+        <w:t xml:space="preserve">    "codebert": {</w:t>
+      </w:r>
+    </w:p>
+    <w:p>
+      <w:r>
+        <w:t xml:space="preserve">      "accuracy": 0.9961666666666666,</w:t>
+      </w:r>
+    </w:p>
+    <w:p>
+      <w:r>
+        <w:t xml:space="preserve">      "precision": 0.9989943010392223,</w:t>
+      </w:r>
+    </w:p>
+    <w:p>
+      <w:r>
+        <w:t xml:space="preserve">      "recall": 0.9933333333333333,</w:t>
+      </w:r>
+    </w:p>
+    <w:p>
+      <w:r>
+        <w:t xml:space="preserve">      "f1": 0.9961557746949691,</w:t>
+      </w:r>
+    </w:p>
+    <w:p>
+      <w:r>
+        <w:t xml:space="preserve">      "balanced_accuracy": 0.9961666666666666,</w:t>
+      </w:r>
+    </w:p>
+    <w:p>
+      <w:r>
+        <w:t xml:space="preserve">      "confusion_matrix": {</w:t>
+      </w:r>
+    </w:p>
+    <w:p>
+      <w:r>
+        <w:t xml:space="preserve">        "tp": 2980,</w:t>
+      </w:r>
+    </w:p>
+    <w:p>
+      <w:r>
+        <w:t xml:space="preserve">        "tn": 2997,</w:t>
+      </w:r>
+    </w:p>
+    <w:p>
+      <w:r>
+        <w:t xml:space="preserve">        "fp": 3,</w:t>
+      </w:r>
+    </w:p>
+    <w:p>
+      <w:r>
+        <w:t xml:space="preserve">        "fn": 20</w:t>
+      </w:r>
+    </w:p>
+    <w:p>
+      <w:r>
+        <w:t xml:space="preserve">      }</w:t>
+      </w:r>
+    </w:p>
+    <w:p>
+      <w:r>
+        <w:t xml:space="preserve">    }</w:t>
+      </w:r>
+    </w:p>
+    <w:p>
+      <w:r>
+        <w:t xml:space="preserve">  },</w:t>
+      </w:r>
+    </w:p>
+    <w:p>
+      <w:r>
+        <w:lastRenderedPageBreak/>
+        <w:t xml:space="preserve">  "skipped": {}</w:t>
+      </w:r>
+    </w:p>
+    <w:p>
+      <w:r>
+        <w:t>}</w:t>
       </w:r>
     </w:p>
     <w:sectPr>
@@ -1323,6 +1965,25 @@
       <w:spacing w:val="5"/>
     </w:rPr>
   </w:style>
+  <w:style w:type="table" w:styleId="TableGrid">
+    <w:name w:val="Table Grid"/>
+    <w:basedOn w:val="TableNormal"/>
+    <w:uiPriority w:val="39"/>
+    <w:rsid w:val="00903725"/>
+    <w:pPr>
+      <w:spacing w:after="0" w:line="240" w:lineRule="auto"/>
+    </w:pPr>
+    <w:tblPr>
+      <w:tblBorders>
+        <w:top w:val="single" w:sz="4" w:space="0" w:color="auto"/>
+        <w:left w:val="single" w:sz="4" w:space="0" w:color="auto"/>
+        <w:bottom w:val="single" w:sz="4" w:space="0" w:color="auto"/>
+        <w:right w:val="single" w:sz="4" w:space="0" w:color="auto"/>
+        <w:insideH w:val="single" w:sz="4" w:space="0" w:color="auto"/>
+        <w:insideV w:val="single" w:sz="4" w:space="0" w:color="auto"/>
+      </w:tblBorders>
+    </w:tblPr>
+  </w:style>
 </w:styles>
 </file>
 

</xml_diff>